<commit_message>
Cap nhat phan RUT KINH NGHIEM SAU BAI DAY: 4 dong cham va xoa dong luu i
</commit_message>
<xml_diff>
--- a/KHBD_Tin_học/Lớp_6/Tiết_00/KHBD_Tin_hoc_Lớp_6_Tiet00_Định_hướng_môn_học_Tin_học_6_-_Phương_ph.docx
+++ b/KHBD_Tin_học/Lớp_6/Tiết_00/KHBD_Tin_hoc_Lớp_6_Tiet00_Định_hướng_môn_học_Tin_học_6_-_Phương_ph.docx
@@ -2729,35 +2729,56 @@
       <w:r>
         <w:rPr>
           <w:rFonts w:ascii="Times New Roman" w:hAnsi="Times New Roman" w:cs="Times New Roman" w:eastAsia="Times New Roman"/>
-          <w:b/>
+          <w:b w:val="0"/>
           <w:i w:val="0"/>
           <w:sz w:val="26"/>
         </w:rPr>
-        <w:t>….……………………………………………………………………………………………..</w:t>
-      </w:r>
-    </w:p>
-    <w:p>
-      <w:pPr>
-        <w:jc w:val="center"/>
+        <w:t>........................................................................................................................</w:t>
+      </w:r>
+    </w:p>
+    <w:p>
+      <w:pPr>
         <w:spacing w:line="276" w:lineRule="auto"/>
       </w:pPr>
       <w:r>
         <w:rPr>
           <w:rFonts w:ascii="Times New Roman" w:hAnsi="Times New Roman" w:cs="Times New Roman" w:eastAsia="Times New Roman"/>
-          <w:b/>
+          <w:b w:val="0"/>
           <w:i w:val="0"/>
           <w:sz w:val="26"/>
         </w:rPr>
-        <w:t>Lưu ý: Sau 1 tuần mới để phần kí</w:t>
+        <w:t>........................................................................................................................</w:t>
+      </w:r>
+    </w:p>
+    <w:p>
+      <w:pPr>
+        <w:spacing w:line="276" w:lineRule="auto"/>
+      </w:pPr>
+      <w:r>
+        <w:rPr>
+          <w:rFonts w:ascii="Times New Roman" w:hAnsi="Times New Roman" w:cs="Times New Roman" w:eastAsia="Times New Roman"/>
+          <w:b w:val="0"/>
+          <w:i w:val="0"/>
+          <w:sz w:val="26"/>
+        </w:rPr>
+        <w:t>........................................................................................................................</w:t>
+      </w:r>
+    </w:p>
+    <w:p>
+      <w:pPr>
+        <w:spacing w:line="276" w:lineRule="auto"/>
+      </w:pPr>
+      <w:r>
+        <w:rPr>
+          <w:rFonts w:ascii="Times New Roman" w:hAnsi="Times New Roman" w:cs="Times New Roman" w:eastAsia="Times New Roman"/>
+          <w:b w:val="0"/>
+          <w:i w:val="0"/>
+          <w:sz w:val="26"/>
+        </w:rPr>
+        <w:t>........................................................................................................................</w:t>
       </w:r>
     </w:p>
     <w:p/>
-    <w:p>
-      <w:pPr>
-        <w:ind w:firstLine="284"/>
-        <w:spacing w:line="276" w:lineRule="auto"/>
-      </w:pPr>
-    </w:p>
     <w:tbl>
       <w:tblPr>
         <w:tblStyle w:val="a1"/>

</xml_diff>